<commit_message>
Translate project documentation and guides into English
</commit_message>
<xml_diff>
--- a/docs/需求流程原文.docx
+++ b/docs/需求流程原文.docx
@@ -23,7 +23,7 @@
           <w:b/>
           <w:sz w:val="32"/>
         </w:rPr>
-        <w:t>完整项目流程</w:t>
+        <w:t>Complete Project Workflow</w:t>
       </w:r>
     </w:p>
     <w:p>
@@ -62,7 +62,7 @@
                 <w:b/>
                 <w:sz w:val="24"/>
               </w:rPr>
-              <w:t>核心目标</w:t>
+              <w:t>Core Goal</w:t>
             </w:r>
           </w:p>
           <w:p>
@@ -70,7 +70,7 @@
               <w:jc w:val="center"/>
             </w:pPr>
             <w:r>
-              <w:t>把客户的一句模糊、多语言询价，转化为一个经过企业数据分析、由老板确认、可以直接发给客户的智能报价。</w:t>
+              <w:t>Turn a vague, multilingual customer inquiry into a smart quotation informed by business data, approved by the owner and ready to send to the customer.</w:t>
             </w:r>
           </w:p>
         </w:tc>
@@ -82,7 +82,7 @@
         <w:pStyle w:val="Heading1"/>
       </w:pPr>
       <w:r>
-        <w:t>一、完整项目流程总览</w:t>
+        <w:t>1. Complete Workflow Overview</w:t>
       </w:r>
     </w:p>
     <w:tbl>
@@ -104,7 +104,7 @@
           </w:tcPr>
           <w:p>
             <w:r>
-              <w:t>阶段</w:t>
+              <w:t>Stage</w:t>
             </w:r>
           </w:p>
         </w:tc>
@@ -114,7 +114,7 @@
           </w:tcPr>
           <w:p>
             <w:r>
-              <w:t>动作</w:t>
+              <w:t>Action</w:t>
             </w:r>
           </w:p>
         </w:tc>
@@ -124,7 +124,7 @@
           </w:tcPr>
           <w:p>
             <w:r>
-              <w:t>系统做什么</w:t>
+              <w:t>What the System Does</w:t>
             </w:r>
           </w:p>
         </w:tc>
@@ -146,7 +146,7 @@
           </w:tcPr>
           <w:p>
             <w:r>
-              <w:t>客户询价</w:t>
+              <w:t>Customer Inquiry</w:t>
             </w:r>
           </w:p>
         </w:tc>
@@ -156,7 +156,7 @@
           </w:tcPr>
           <w:p>
             <w:r>
-              <w:t>WhatsApp / Web 输入自然语言需求</w:t>
+              <w:t>Natural-language requirements entered through WhatsApp / Web</w:t>
             </w:r>
           </w:p>
         </w:tc>
@@ -178,7 +178,7 @@
           </w:tcPr>
           <w:p>
             <w:r>
-              <w:t>AI 理解需求</w:t>
+              <w:t>AI Understands Requirements</w:t>
             </w:r>
           </w:p>
         </w:tc>
@@ -188,7 +188,7 @@
           </w:tcPr>
           <w:p>
             <w:r>
-              <w:t>提取产品类型、用途、数量、规格、地区等</w:t>
+              <w:t>Extract product type, application, quantity, specification, area and more</w:t>
             </w:r>
           </w:p>
         </w:tc>
@@ -210,7 +210,7 @@
           </w:tcPr>
           <w:p>
             <w:r>
-              <w:t>产品匹配</w:t>
+              <w:t>Product Matching</w:t>
             </w:r>
           </w:p>
         </w:tc>
@@ -220,7 +220,7 @@
           </w:tcPr>
           <w:p>
             <w:r>
-              <w:t>查询企业自己的 Product + Inventory 数据</w:t>
+              <w:t>Query the business’s own Product + Inventory data</w:t>
             </w:r>
           </w:p>
         </w:tc>
@@ -242,7 +242,7 @@
           </w:tcPr>
           <w:p>
             <w:r>
-              <w:t>计算原价</w:t>
+              <w:t>Calculate Original Price</w:t>
             </w:r>
           </w:p>
         </w:tc>
@@ -252,7 +252,7 @@
           </w:tcPr>
           <w:p>
             <w:r>
-              <w:t>产品单价 × 数量 + 基础配送规则</w:t>
+              <w:t>Product unit price × quantity + base delivery rules</w:t>
             </w:r>
           </w:p>
         </w:tc>
@@ -284,7 +284,7 @@
           </w:tcPr>
           <w:p>
             <w:r>
-              <w:t>根据历史经营数据推荐折扣与运费</w:t>
+              <w:t>Recommend discounts and freight from historical business data</w:t>
             </w:r>
           </w:p>
         </w:tc>
@@ -306,7 +306,7 @@
           </w:tcPr>
           <w:p>
             <w:r>
-              <w:t>老板审批</w:t>
+              <w:t>Owner Approval</w:t>
             </w:r>
           </w:p>
         </w:tc>
@@ -316,7 +316,7 @@
           </w:tcPr>
           <w:p>
             <w:r>
-              <w:t>Accept / Edit，AI 不直接决定最终价格</w:t>
+              <w:t>Accept / Edit; AI does not directly set the final price</w:t>
             </w:r>
           </w:p>
         </w:tc>
@@ -338,7 +338,7 @@
           </w:tcPr>
           <w:p>
             <w:r>
-              <w:t>生成报价</w:t>
+              <w:t>Generate Quotation</w:t>
             </w:r>
           </w:p>
         </w:tc>
@@ -348,7 +348,7 @@
           </w:tcPr>
           <w:p>
             <w:r>
-              <w:t>Quotation / PDF + 客户语言回复</w:t>
+              <w:t>Quotation / PDF + a reply in the customer’s language</w:t>
             </w:r>
           </w:p>
         </w:tc>
@@ -370,7 +370,7 @@
           </w:tcPr>
           <w:p>
             <w:r>
-              <w:t>记录数据</w:t>
+              <w:t>Record Data</w:t>
             </w:r>
           </w:p>
         </w:tc>
@@ -380,7 +380,7 @@
           </w:tcPr>
           <w:p>
             <w:r>
-              <w:t>保存报价、修改、审批与结果，进入历史数据</w:t>
+              <w:t>Save quotations, edits, approvals and outcomes as historical data</w:t>
             </w:r>
           </w:p>
         </w:tc>
@@ -395,7 +395,7 @@
         <w:rPr>
           <w:b/>
         </w:rPr>
-        <w:t>客户需求 → AI理解 → 找货 → 原价 → 数据驱动定价 → 老板审批 → 报价 → 数据沉淀</w:t>
+        <w:t>Customer Need → AI Understanding → Find Products → Original Price → Data-Driven Pricing → Owner Approval → Quotation → Historical Data</w:t>
       </w:r>
     </w:p>
     <w:p>
@@ -403,7 +403,7 @@
         <w:pStyle w:val="Heading1"/>
       </w:pPr>
       <w:r>
-        <w:t>二、Step 1｜客户询价</w:t>
+        <w:t>2. Step 1 | Customer Inquiry</w:t>
       </w:r>
     </w:p>
     <w:p>
@@ -411,14 +411,14 @@
         <w:spacing w:after="100"/>
       </w:pPr>
       <w:r>
-        <w:t>客户不需要知道品牌或 SKU，只需要说自己的需求。</w:t>
+        <w:t xml:space="preserve">Customers do not need to know a brand or SKU; they only need to describe what they need. </w:t>
         <w:br/>
-        <w:t>例如：</w:t>
+        <w:t xml:space="preserve">For example: </w:t>
         <w:br/>
         <w:t>“Hi boss, I need 20 bags cement for plastering. Prefer fast setting. Deliver to Shah Alam. How much?”</w:t>
         <w:br/>
         <w:br/>
-        <w:t>系统接收到的是自然语言，而不是固定表单。</w:t>
+        <w:t xml:space="preserve"> The system receives natural language rather than a fixed form.</w:t>
       </w:r>
     </w:p>
     <w:p>
@@ -427,7 +427,7 @@
         <w:spacing w:after="20"/>
       </w:pPr>
       <w:r>
-        <w:t>产品类型：Cement</w:t>
+        <w:t>Product type: Cement</w:t>
       </w:r>
     </w:p>
     <w:p>
@@ -436,7 +436,7 @@
         <w:spacing w:after="20"/>
       </w:pPr>
       <w:r>
-        <w:t>数量：20 bags</w:t>
+        <w:t>Quantity: 20 bags</w:t>
       </w:r>
     </w:p>
     <w:p>
@@ -445,7 +445,7 @@
         <w:spacing w:after="20"/>
       </w:pPr>
       <w:r>
-        <w:t>用途：Plastering</w:t>
+        <w:t>Application: Plastering</w:t>
       </w:r>
     </w:p>
     <w:p>
@@ -454,7 +454,7 @@
         <w:spacing w:after="20"/>
       </w:pPr>
       <w:r>
-        <w:t>偏好：Fast setting</w:t>
+        <w:t>Preference: Fast setting</w:t>
       </w:r>
     </w:p>
     <w:p>
@@ -463,7 +463,7 @@
         <w:spacing w:after="20"/>
       </w:pPr>
       <w:r>
-        <w:t>配送地区：Shah Alam</w:t>
+        <w:t>Delivery area: Shah Alam</w:t>
       </w:r>
     </w:p>
     <w:p>
@@ -472,7 +472,7 @@
         <w:spacing w:after="20"/>
       </w:pPr>
       <w:r>
-        <w:t>品牌：未指定</w:t>
+        <w:t>Brand: Unspecified</w:t>
       </w:r>
     </w:p>
     <w:p>
@@ -480,7 +480,7 @@
         <w:pStyle w:val="Heading1"/>
       </w:pPr>
       <w:r>
-        <w:t>三、Step 2｜AI 理解客户需求</w:t>
+        <w:t>3. Step 2 | AI Understands Customer Requirements</w:t>
       </w:r>
     </w:p>
     <w:p>
@@ -488,10 +488,10 @@
         <w:spacing w:after="100"/>
       </w:pPr>
       <w:r>
-        <w:t>AI 将自然语言转换成系统可以处理的结构化需求。</w:t>
+        <w:t xml:space="preserve">AI converts natural language into structured requirements that the system can process. </w:t>
         <w:br/>
         <w:br/>
-        <w:t>如果缺少真正影响报价的必要信息，例如数量或配送地区，AI 应该追问，而不是自行猜测。</w:t>
+        <w:t>If necessary information that affects the quotation is missing, such as quantity or delivery area, AI should ask a follow-up question rather than guess.</w:t>
       </w:r>
     </w:p>
     <w:p>
@@ -500,7 +500,7 @@
         <w:spacing w:after="20"/>
       </w:pPr>
       <w:r>
-        <w:t>输入：中文 / English / BM / 混合语言</w:t>
+        <w:t>Input: Chinese / English / BM / mixed languages</w:t>
       </w:r>
     </w:p>
     <w:p>
@@ -509,7 +509,7 @@
         <w:spacing w:after="20"/>
       </w:pPr>
       <w:r>
-        <w:t>输出：结构化 Requirement JSON</w:t>
+        <w:t>Output: Structured Requirement JSON</w:t>
       </w:r>
     </w:p>
     <w:p>
@@ -518,7 +518,7 @@
         <w:spacing w:after="20"/>
       </w:pPr>
       <w:r>
-        <w:t>核心字段：category、quantity、unit、application、specification/preference、area、brand</w:t>
+        <w:t>Core fields: category, quantity, unit, application, specification/preference, area, brand</w:t>
       </w:r>
     </w:p>
     <w:p>
@@ -526,7 +526,7 @@
         <w:pStyle w:val="Heading1"/>
       </w:pPr>
       <w:r>
-        <w:t>四、Step 3｜从企业自己的数据匹配产品</w:t>
+        <w:t>4. Step 3 | Match Products from the Business’s Own Data</w:t>
       </w:r>
     </w:p>
     <w:p>
@@ -534,12 +534,12 @@
         <w:spacing w:after="100"/>
       </w:pPr>
       <w:r>
-        <w:t>系统读取企业自己的 Product Excel 和 Inventory 数据。</w:t>
+        <w:t xml:space="preserve">The system reads the business’s own Product Excel and Inventory data. </w:t>
         <w:br/>
-        <w:t>客户不指定品牌时，AI 根据用途、类型、规格等需求找到最适合的商品。</w:t>
+        <w:t xml:space="preserve">If no brand is specified, AI finds the most suitable product based on application, type, specification and other requirements. </w:t>
         <w:br/>
         <w:br/>
-        <w:t>系统显示 Best Match 和 Alternative，并解释为什么匹配。</w:t>
+        <w:t>The system shows a Best Match and an Alternative and explains the match.</w:t>
       </w:r>
     </w:p>
     <w:p>
@@ -548,7 +548,7 @@
         <w:spacing w:after="20"/>
       </w:pPr>
       <w:r>
-        <w:t>Best Match：最符合客户需求且有库存的产品</w:t>
+        <w:t>Best Match: The in-stock product that best meets the customer’s requirements</w:t>
       </w:r>
     </w:p>
     <w:p>
@@ -557,7 +557,7 @@
         <w:spacing w:after="20"/>
       </w:pPr>
       <w:r>
-        <w:t>Alternative：其他可行产品</w:t>
+        <w:t>Alternative: Other suitable products</w:t>
       </w:r>
     </w:p>
     <w:p>
@@ -566,7 +566,7 @@
         <w:spacing w:after="20"/>
       </w:pPr>
       <w:r>
-        <w:t>显示：品牌、产品、规格、库存、单价</w:t>
+        <w:t>Display: Brand, product, specification, stock and unit price</w:t>
       </w:r>
     </w:p>
     <w:p>
@@ -575,7 +575,7 @@
         <w:spacing w:after="20"/>
       </w:pPr>
       <w:r>
-        <w:t>显示匹配原因，例如“适合 plastering + fast setting”</w:t>
+        <w:t>Show the match reason, such as “Suitable for plastering + fast setting”</w:t>
       </w:r>
     </w:p>
     <w:p>
@@ -583,7 +583,7 @@
         <w:pStyle w:val="Heading1"/>
       </w:pPr>
       <w:r>
-        <w:t>五、Step 4｜计算原始报价</w:t>
+        <w:t>5. Step 4 | Calculate the Original Quotation</w:t>
       </w:r>
     </w:p>
     <w:p>
@@ -591,15 +591,15 @@
         <w:spacing w:after="100"/>
       </w:pPr>
       <w:r>
-        <w:t>产品确定后，普通程序进行确定性计算，不需要 AI。</w:t>
+        <w:t xml:space="preserve">Once products are selected, ordinary program logic performs deterministic calculations; AI is not needed. </w:t>
         <w:br/>
         <w:br/>
-        <w:t>例如：</w:t>
+        <w:t xml:space="preserve">For example: </w:t>
         <w:br/>
         <w:t>20 bags × RM23 = RM460</w:t>
         <w:br/>
         <w:br/>
-        <w:t>此时先得到 Original Product Price，再进入 Pricing Intelligence。</w:t>
+        <w:t>. This gives the Original Product Price before Pricing Intelligence.</w:t>
       </w:r>
     </w:p>
     <w:p>
@@ -617,7 +617,7 @@
         <w:spacing w:after="20"/>
       </w:pPr>
       <w:r>
-        <w:t>根据配送地区取得基础运费/配送规则</w:t>
+        <w:t>Look up base freight / delivery rules for the delivery area</w:t>
       </w:r>
     </w:p>
     <w:p>
@@ -626,7 +626,7 @@
         <w:spacing w:after="20"/>
       </w:pPr>
       <w:r>
-        <w:t>输出 Original Price</w:t>
+        <w:t>Output the Original Price</w:t>
       </w:r>
     </w:p>
     <w:p>
@@ -635,7 +635,7 @@
         <w:spacing w:after="20"/>
       </w:pPr>
       <w:r>
-        <w:t>不要让 LLM 负责数学计算</w:t>
+        <w:t>Do not use an LLM for arithmetic</w:t>
       </w:r>
     </w:p>
     <w:p>
@@ -643,7 +643,7 @@
         <w:pStyle w:val="Heading1"/>
       </w:pPr>
       <w:r>
-        <w:t>六、Step 5｜Pricing Intelligence 推荐折扣与运费</w:t>
+        <w:t>6. Step 5 | Pricing Intelligence Recommends Discounts and Freight</w:t>
       </w:r>
     </w:p>
     <w:p>
@@ -651,10 +651,10 @@
         <w:spacing w:after="100"/>
       </w:pPr>
       <w:r>
-        <w:t>这是项目最核心的第二层能力。</w:t>
+        <w:t xml:space="preserve">This is the project’s central second layer of capability. </w:t>
         <w:br/>
         <w:br/>
-        <w:t>系统读取过去的经营数据，不是单纯看一个固定折扣，而是结合历史交易情况给老板一个“为什么这样报价”的建议。</w:t>
+        <w:t>The system reads past business data and uses transaction history, rather than a single fixed discount, to explain to the owner why a price is suggested.</w:t>
       </w:r>
     </w:p>
     <w:p>
@@ -663,7 +663,7 @@
         <w:spacing w:after="20"/>
       </w:pPr>
       <w:r>
-        <w:t>历史平均折扣</w:t>
+        <w:t>Historical average discount</w:t>
       </w:r>
     </w:p>
     <w:p>
@@ -672,7 +672,7 @@
         <w:spacing w:after="20"/>
       </w:pPr>
       <w:r>
-        <w:t>类似订单的报价转化率</w:t>
+        <w:t>Quotation conversion rate for similar orders</w:t>
       </w:r>
     </w:p>
     <w:p>
@@ -681,7 +681,7 @@
         <w:spacing w:after="20"/>
       </w:pPr>
       <w:r>
-        <w:t>产品过去销量</w:t>
+        <w:t>Past product sales</w:t>
       </w:r>
     </w:p>
     <w:p>
@@ -690,7 +690,7 @@
         <w:spacing w:after="20"/>
       </w:pPr>
       <w:r>
-        <w:t>当前库存水平</w:t>
+        <w:t>Current inventory level</w:t>
       </w:r>
     </w:p>
     <w:p>
@@ -699,7 +699,7 @@
         <w:spacing w:after="20"/>
       </w:pPr>
       <w:r>
-        <w:t>该地区历史配送成本</w:t>
+        <w:t>Historical delivery costs for the area</w:t>
       </w:r>
     </w:p>
     <w:p>
@@ -708,7 +708,7 @@
         <w:spacing w:after="20"/>
       </w:pPr>
       <w:r>
-        <w:t>最低利润/折扣规则</w:t>
+        <w:t>Minimum profit / discount rules</w:t>
       </w:r>
     </w:p>
     <w:p>
@@ -716,7 +716,7 @@
         <w:pStyle w:val="Heading1"/>
       </w:pPr>
       <w:r>
-        <w:t>七、Step 6｜老板审批</w:t>
+        <w:t>7. Step 6 | Owner Approval</w:t>
       </w:r>
     </w:p>
     <w:p>
@@ -724,12 +724,12 @@
         <w:spacing w:after="100"/>
       </w:pPr>
       <w:r>
-        <w:t>系统把“原价”和“AI 建议”同时展示给老板。</w:t>
+        <w:t xml:space="preserve">The system shows the Original Price and AI Recommendation together. </w:t>
         <w:br/>
         <w:br/>
-        <w:t>AI 只能 Recommend，不能自动决定最终价格。</w:t>
+        <w:t xml:space="preserve">AI may only Recommend; it cannot automatically decide the final price. </w:t>
         <w:br/>
-        <w:t>老板可以直接 Accept，也可以 Edit 后再 Approve。</w:t>
+        <w:t>The owner may Accept directly or Edit and then Approve.</w:t>
       </w:r>
     </w:p>
     <w:p>
@@ -791,7 +791,7 @@
         <w:pStyle w:val="Heading1"/>
       </w:pPr>
       <w:r>
-        <w:t>八、Step 7｜生成正式报价</w:t>
+        <w:t>8. Step 7 | Generate the Final Quotation</w:t>
       </w:r>
     </w:p>
     <w:p>
@@ -799,10 +799,10 @@
         <w:spacing w:after="100"/>
       </w:pPr>
       <w:r>
-        <w:t>老板批准后，系统生成正式 quotation，并准备客户可以直接使用的回复。</w:t>
+        <w:t xml:space="preserve">After owner approval, the system generates the final quotation and prepares a customer-ready reply. </w:t>
         <w:br/>
         <w:br/>
-        <w:t>输出应该尽可能减少老板的手工操作。</w:t>
+        <w:t>The output should minimize manual work for the owner.</w:t>
       </w:r>
     </w:p>
     <w:p>
@@ -883,7 +883,7 @@
         <w:spacing w:after="20"/>
       </w:pPr>
       <w:r>
-        <w:t>WhatsApp 回复草稿</w:t>
+        <w:t>WhatsApp Reply Draft</w:t>
       </w:r>
     </w:p>
     <w:p>
@@ -891,7 +891,7 @@
         <w:pStyle w:val="Heading1"/>
       </w:pPr>
       <w:r>
-        <w:t>九、Step 8｜记录并形成 Learning Loop</w:t>
+        <w:t>9. Step 8 | Record Data and Build a Learning Loop</w:t>
       </w:r>
     </w:p>
     <w:p>
@@ -899,13 +899,13 @@
         <w:spacing w:after="100"/>
       </w:pPr>
       <w:r>
-        <w:t>这次报价不是流程终点。</w:t>
+        <w:t xml:space="preserve">The quotation is not the end of the workflow. </w:t>
         <w:br/>
         <w:br/>
-        <w:t>系统把报价结果、老板修改和最终成交结果保存下来，成为未来 Pricing Intelligence 的历史数据。</w:t>
+        <w:t xml:space="preserve">The system saves quotation outcomes, owner edits and final sales outcomes as historical data for future Pricing Intelligence. </w:t>
         <w:br/>
         <w:br/>
-        <w:t>因此，每一次报价都在帮助下一次报价。</w:t>
+        <w:t>Each quotation therefore helps improve the next one.</w:t>
       </w:r>
     </w:p>
     <w:p>
@@ -914,7 +914,7 @@
         <w:spacing w:after="20"/>
       </w:pPr>
       <w:r>
-        <w:t>保存 Quote ID</w:t>
+        <w:t>Save the Quote ID</w:t>
       </w:r>
     </w:p>
     <w:p>
@@ -923,7 +923,7 @@
         <w:spacing w:after="20"/>
       </w:pPr>
       <w:r>
-        <w:t>保存 AI 推荐值</w:t>
+        <w:t>Save AI-recommended values</w:t>
       </w:r>
     </w:p>
     <w:p>
@@ -932,7 +932,7 @@
         <w:spacing w:after="20"/>
       </w:pPr>
       <w:r>
-        <w:t>保存老板最终修改值</w:t>
+        <w:t>Save the owner’s final edited values</w:t>
       </w:r>
     </w:p>
     <w:p>
@@ -941,7 +941,7 @@
         <w:spacing w:after="20"/>
       </w:pPr>
       <w:r>
-        <w:t>保存审批人和时间</w:t>
+        <w:t>Save the approver and approval time</w:t>
       </w:r>
     </w:p>
     <w:p>
@@ -950,7 +950,7 @@
         <w:spacing w:after="20"/>
       </w:pPr>
       <w:r>
-        <w:t>保存报价状态 / 成交结果</w:t>
+        <w:t>Save quotation status / sales outcome</w:t>
       </w:r>
     </w:p>
     <w:p>
@@ -959,7 +959,7 @@
         <w:spacing w:after="20"/>
       </w:pPr>
       <w:r>
-        <w:t>进入下一轮历史经营数据</w:t>
+        <w:t>Feed the data into the next round of business history</w:t>
       </w:r>
     </w:p>
     <w:p>
@@ -967,7 +967,7 @@
         <w:pStyle w:val="Heading1"/>
       </w:pPr>
       <w:r>
-        <w:t>十、完整实例：一次询价如何走完整流程</w:t>
+        <w:t>10. Complete Example: One Inquiry Through the Entire Workflow</w:t>
       </w:r>
     </w:p>
     <w:tbl>
@@ -988,7 +988,7 @@
           </w:tcPr>
           <w:p>
             <w:r>
-              <w:t>环节</w:t>
+              <w:t>Stage</w:t>
             </w:r>
           </w:p>
         </w:tc>
@@ -998,7 +998,7 @@
           </w:tcPr>
           <w:p>
             <w:r>
-              <w:t>实际发生什么</w:t>
+              <w:t>What Actually Happens</w:t>
             </w:r>
           </w:p>
         </w:tc>
@@ -1010,7 +1010,7 @@
           </w:tcPr>
           <w:p>
             <w:r>
-              <w:t>客户</w:t>
+              <w:t>Customer</w:t>
             </w:r>
           </w:p>
         </w:tc>
@@ -1042,7 +1042,7 @@
           </w:tcPr>
           <w:p>
             <w:r>
-              <w:t>识别：Cement / 20 bags / Plastering / Fast setting / Shah Alam</w:t>
+              <w:t>Identify: Cement / 20 bags / Plastering / Fast setting / Shah Alam</w:t>
             </w:r>
           </w:p>
         </w:tc>
@@ -1054,7 +1054,7 @@
           </w:tcPr>
           <w:p>
             <w:r>
-              <w:t>产品匹配</w:t>
+              <w:t>Product Matching</w:t>
             </w:r>
           </w:p>
         </w:tc>
@@ -1064,7 +1064,7 @@
           </w:tcPr>
           <w:p>
             <w:r>
-              <w:t>Best Match：Brand A Fast Cement，RM23/bag，库存 85</w:t>
+              <w:t>Best Match: Brand A Fast Cement, RM23/bag, stock 85</w:t>
             </w:r>
           </w:p>
         </w:tc>
@@ -1076,7 +1076,7 @@
           </w:tcPr>
           <w:p>
             <w:r>
-              <w:t>原价</w:t>
+              <w:t>Original Price</w:t>
             </w:r>
           </w:p>
         </w:tc>
@@ -1098,7 +1098,7 @@
           </w:tcPr>
           <w:p>
             <w:r>
-              <w:t>历史数据</w:t>
+              <w:t>Historical Data</w:t>
             </w:r>
           </w:p>
         </w:tc>
@@ -1108,7 +1108,7 @@
           </w:tcPr>
           <w:p>
             <w:r>
-              <w:t>类似订单平均折扣约 3%；Shah Alam 历史配送成本约 RM28；当前库存偏高</w:t>
+              <w:t>Similar orders have an average discount of about 3%; historical delivery cost in Shah Alam is about RM28; current stock is high</w:t>
             </w:r>
           </w:p>
         </w:tc>
@@ -1130,7 +1130,7 @@
           </w:tcPr>
           <w:p>
             <w:r>
-              <w:t>推荐 Discount 3% + Delivery RM25</w:t>
+              <w:t>Recommend Discount 3% + Delivery RM25</w:t>
             </w:r>
           </w:p>
         </w:tc>
@@ -1142,7 +1142,7 @@
           </w:tcPr>
           <w:p>
             <w:r>
-              <w:t>老板</w:t>
+              <w:t>Owner</w:t>
             </w:r>
           </w:p>
         </w:tc>
@@ -1152,7 +1152,7 @@
           </w:tcPr>
           <w:p>
             <w:r>
-              <w:t>Accept，或修改成自己的价格</w:t>
+              <w:t>Accept, or edit to the owner’s chosen price</w:t>
             </w:r>
           </w:p>
         </w:tc>
@@ -1164,7 +1164,7 @@
           </w:tcPr>
           <w:p>
             <w:r>
-              <w:t>输出</w:t>
+              <w:t>Output</w:t>
             </w:r>
           </w:p>
         </w:tc>
@@ -1174,7 +1174,7 @@
           </w:tcPr>
           <w:p>
             <w:r>
-              <w:t>生成正式 Quotation + WhatsApp 回复</w:t>
+              <w:t>Generate the final Quotation + WhatsApp reply</w:t>
             </w:r>
           </w:p>
         </w:tc>
@@ -1186,7 +1186,7 @@
           </w:tcPr>
           <w:p>
             <w:r>
-              <w:t>数据沉淀</w:t>
+              <w:t>Historical Record</w:t>
             </w:r>
           </w:p>
         </w:tc>
@@ -1196,7 +1196,7 @@
           </w:tcPr>
           <w:p>
             <w:r>
-              <w:t>记录本次 AI 建议、老板修改、最终报价与成交结果</w:t>
+              <w:t>Record this AI recommendation, owner edits, final quotation and sales outcome</w:t>
             </w:r>
           </w:p>
         </w:tc>
@@ -1207,7 +1207,7 @@
         <w:pStyle w:val="Heading1"/>
       </w:pPr>
       <w:r>
-        <w:t>十一、项目最重要的 Learning Loop</w:t>
+        <w:t>11. The Project’s Key Learning Loop</w:t>
       </w:r>
     </w:p>
     <w:p>
@@ -1219,7 +1219,7 @@
           <w:b/>
           <w:sz w:val="24"/>
         </w:rPr>
-        <w:t>历史订单 / 折扣 / 运费 / 库存</w:t>
+        <w:t>Historical orders / discounts / freight / inventory</w:t>
         <w:br/>
         <w:t>↓</w:t>
         <w:br/>
@@ -1227,27 +1227,27 @@
         <w:br/>
         <w:t>↓</w:t>
         <w:br/>
-        <w:t>新的客户询价</w:t>
+        <w:t>New customer inquiry</w:t>
         <w:br/>
         <w:t>↓</w:t>
         <w:br/>
-        <w:t>AI 理解 + 产品匹配</w:t>
+        <w:t>AI understanding + product matching</w:t>
         <w:br/>
         <w:t>↓</w:t>
         <w:br/>
-        <w:t>原价 + 折扣/运费建议</w:t>
+        <w:t>Original price + discount/freight suggestions</w:t>
         <w:br/>
         <w:t>↓</w:t>
         <w:br/>
-        <w:t>老板审批</w:t>
+        <w:t>Owner approval</w:t>
         <w:br/>
         <w:t>↓</w:t>
         <w:br/>
-        <w:t>正式报价</w:t>
+        <w:t>Final quotation</w:t>
         <w:br/>
         <w:t>↓</w:t>
         <w:br/>
-        <w:t>报价结果进入历史数据</w:t>
+        <w:t>Quotation outcomes enter historical data</w:t>
         <w:br/>
         <w:t>↺</w:t>
       </w:r>
@@ -1257,7 +1257,7 @@
         <w:pStyle w:val="Heading1"/>
       </w:pPr>
       <w:r>
-        <w:t>十二、整个流程中，人与 AI 的边界</w:t>
+        <w:t>12. Human and AI Responsibilities Throughout the Workflow</w:t>
       </w:r>
     </w:p>
     <w:tbl>
@@ -1279,7 +1279,7 @@
           </w:tcPr>
           <w:p>
             <w:r>
-              <w:t>环节</w:t>
+              <w:t>Stage</w:t>
             </w:r>
           </w:p>
         </w:tc>
@@ -1289,7 +1289,7 @@
           </w:tcPr>
           <w:p>
             <w:r>
-              <w:t>AI / 系统负责</w:t>
+              <w:t>AI / System Responsibility</w:t>
             </w:r>
           </w:p>
         </w:tc>
@@ -1299,7 +1299,7 @@
           </w:tcPr>
           <w:p>
             <w:r>
-              <w:t>人负责</w:t>
+              <w:t>Human Responsibility</w:t>
             </w:r>
           </w:p>
         </w:tc>
@@ -1311,7 +1311,7 @@
           </w:tcPr>
           <w:p>
             <w:r>
-              <w:t>理解客户</w:t>
+              <w:t>Understand the Customer</w:t>
             </w:r>
           </w:p>
         </w:tc>
@@ -1321,7 +1321,7 @@
           </w:tcPr>
           <w:p>
             <w:r>
-              <w:t>理解多语言自然语言、提取需求</w:t>
+              <w:t>Understand multilingual natural language and extract requirements</w:t>
             </w:r>
           </w:p>
         </w:tc>
@@ -1331,7 +1331,7 @@
           </w:tcPr>
           <w:p>
             <w:r>
-              <w:t>补充缺失信息</w:t>
+              <w:t>Supply missing information</w:t>
             </w:r>
           </w:p>
         </w:tc>
@@ -1343,7 +1343,7 @@
           </w:tcPr>
           <w:p>
             <w:r>
-              <w:t>找产品</w:t>
+              <w:t>Find Products</w:t>
             </w:r>
           </w:p>
         </w:tc>
@@ -1353,7 +1353,7 @@
           </w:tcPr>
           <w:p>
             <w:r>
-              <w:t>根据需求匹配候选商品</w:t>
+              <w:t>Match candidate products to the requirements</w:t>
             </w:r>
           </w:p>
         </w:tc>
@@ -1363,7 +1363,7 @@
           </w:tcPr>
           <w:p>
             <w:r>
-              <w:t>处理异常/不合适结果</w:t>
+              <w:t>Handle exceptions / unsuitable results</w:t>
             </w:r>
           </w:p>
         </w:tc>
@@ -1375,7 +1375,7 @@
           </w:tcPr>
           <w:p>
             <w:r>
-              <w:t>计算原价</w:t>
+              <w:t>Calculate Original Price</w:t>
             </w:r>
           </w:p>
         </w:tc>
@@ -1385,7 +1385,7 @@
           </w:tcPr>
           <w:p>
             <w:r>
-              <w:t>系统准确计算</w:t>
+              <w:t>Calculate accurately in the system</w:t>
             </w:r>
           </w:p>
         </w:tc>
@@ -1407,7 +1407,7 @@
           </w:tcPr>
           <w:p>
             <w:r>
-              <w:t>定价建议</w:t>
+              <w:t>Pricing Suggestions</w:t>
             </w:r>
           </w:p>
         </w:tc>
@@ -1417,7 +1417,7 @@
           </w:tcPr>
           <w:p>
             <w:r>
-              <w:t>根据历史数据推荐折扣/运费并解释原因</w:t>
+              <w:t>Recommend discounts/freight from historical data and explain the reasons</w:t>
             </w:r>
           </w:p>
         </w:tc>
@@ -1427,7 +1427,7 @@
           </w:tcPr>
           <w:p>
             <w:r>
-              <w:t>决定是否采用</w:t>
+              <w:t>Decide whether to adopt the suggestion</w:t>
             </w:r>
           </w:p>
         </w:tc>
@@ -1439,7 +1439,7 @@
           </w:tcPr>
           <w:p>
             <w:r>
-              <w:t>最终报价</w:t>
+              <w:t>Final Quotation</w:t>
             </w:r>
           </w:p>
         </w:tc>
@@ -1449,7 +1449,7 @@
           </w:tcPr>
           <w:p>
             <w:r>
-              <w:t>生成 quotation</w:t>
+              <w:t>Generate the quotation</w:t>
             </w:r>
           </w:p>
         </w:tc>
@@ -1459,7 +1459,7 @@
           </w:tcPr>
           <w:p>
             <w:r>
-              <w:t>最终审批</w:t>
+              <w:t>Give final approval</w:t>
             </w:r>
           </w:p>
         </w:tc>
@@ -1471,7 +1471,7 @@
           </w:tcPr>
           <w:p>
             <w:r>
-              <w:t>记录</w:t>
+              <w:t>Record Data</w:t>
             </w:r>
           </w:p>
         </w:tc>
@@ -1481,7 +1481,7 @@
           </w:tcPr>
           <w:p>
             <w:r>
-              <w:t>自动记录操作</w:t>
+              <w:t>Automatically log actions</w:t>
             </w:r>
           </w:p>
         </w:tc>
@@ -1502,7 +1502,7 @@
         <w:pStyle w:val="Heading1"/>
       </w:pPr>
       <w:r>
-        <w:t>十三、项目最终要让评委看到什么</w:t>
+        <w:t>13. What the Project Should Demonstrate to the Judges</w:t>
       </w:r>
     </w:p>
     <w:p>
@@ -1510,7 +1510,7 @@
         <w:rPr>
           <w:b/>
         </w:rPr>
-        <w:t>一个客户询价进来后，整个过程不再需要老板自己：</w:t>
+        <w:t>When a customer inquiry arrives, the owner should no longer need to perform each of these tasks manually:</w:t>
       </w:r>
     </w:p>
     <w:p>
@@ -1518,7 +1518,7 @@
         <w:pStyle w:val="ListBullet"/>
       </w:pPr>
       <w:r>
-        <w:t>理解客户到底想买什么</w:t>
+        <w:t>Work out what the customer actually wants to buy</w:t>
       </w:r>
     </w:p>
     <w:p>
@@ -1526,7 +1526,7 @@
         <w:pStyle w:val="ListBullet"/>
       </w:pPr>
       <w:r>
-        <w:t>翻 Excel 找产品</w:t>
+        <w:t>Search Excel for products</w:t>
       </w:r>
     </w:p>
     <w:p>
@@ -1534,7 +1534,7 @@
         <w:pStyle w:val="ListBullet"/>
       </w:pPr>
       <w:r>
-        <w:t>手动计算数量和价格</w:t>
+        <w:t>Calculate quantities and prices manually</w:t>
       </w:r>
     </w:p>
     <w:p>
@@ -1542,7 +1542,7 @@
         <w:pStyle w:val="ListBullet"/>
       </w:pPr>
       <w:r>
-        <w:t>凭记忆决定折扣</w:t>
+        <w:t>Choose a discount from memory</w:t>
       </w:r>
     </w:p>
     <w:p>
@@ -1550,7 +1550,7 @@
         <w:pStyle w:val="ListBullet"/>
       </w:pPr>
       <w:r>
-        <w:t>查询过去运费</w:t>
+        <w:t>Look up past freight costs</w:t>
       </w:r>
     </w:p>
     <w:p>
@@ -1558,7 +1558,7 @@
         <w:pStyle w:val="ListBullet"/>
       </w:pPr>
       <w:r>
-        <w:t>重新制作报价单</w:t>
+        <w:t>Recreate the quotation document</w:t>
       </w:r>
     </w:p>
     <w:p>
@@ -1566,7 +1566,7 @@
         <w:rPr>
           <w:b/>
         </w:rPr>
-        <w:t>系统自动完成前面的工作，但最后价格仍由老板控制。</w:t>
+        <w:t>The system handles the preceding work automatically, while the owner retains control of the final price.</w:t>
       </w:r>
     </w:p>
     <w:p>
@@ -1578,7 +1578,7 @@
           <w:b/>
           <w:sz w:val="30"/>
         </w:rPr>
-        <w:t>让过去的生意经验，参与下一次报价。</w:t>
+        <w:t>Let past business experience inform the next quotation.</w:t>
       </w:r>
     </w:p>
     <w:sectPr>

</xml_diff>